<commit_message>
Updated the Fuzz Testing - Establish Settings Procedure tertiary document (reference to video motivating the inclusion of the development team)
</commit_message>
<xml_diff>
--- a/source/reference_documents/tertiary_documents/implementation/Fuzz Testing/establish settings/Fuzz Testing - Establish Settings.docx
+++ b/source/reference_documents/tertiary_documents/implementation/Fuzz Testing/establish settings/Fuzz Testing - Establish Settings.docx
@@ -40,7 +40,7 @@
         <w:t xml:space="preserve">Version </w:t>
       </w:r>
       <w:r>
-        <w:t>2</w:t>
+        <w:t>3</w:t>
       </w:r>
     </w:p>
     <w:p>
@@ -57,7 +57,7 @@
         <w:rPr>
           <w:noProof/>
         </w:rPr>
-        <w:t>5/13/26 2:45 PM</w:t>
+        <w:t>6/23/26 12:52 PM</w:t>
       </w:r>
       <w:r>
         <w:fldChar w:fldCharType="end"/>
@@ -1578,6 +1578,67 @@
       </w:r>
       <w:r>
         <w:t xml:space="preserve"> or as large as the entire project</w:t>
+      </w:r>
+      <w:r>
+        <w:t>.</w:t>
+      </w:r>
+    </w:p>
+    <w:p>
+      <w:pPr>
+        <w:pStyle w:val="Note"/>
+      </w:pPr>
+      <w:r>
+        <w:rPr>
+          <w:b/>
+          <w:bCs/>
+          <w:color w:val="0070C0"/>
+        </w:rPr>
+        <w:t>Note:</w:t>
+      </w:r>
+      <w:r>
+        <w:tab/>
+      </w:r>
+      <w:r>
+        <w:t>A</w:t>
+      </w:r>
+      <w:r>
+        <w:t xml:space="preserve"> link to a</w:t>
+      </w:r>
+      <w:r>
+        <w:t xml:space="preserve"> video </w:t>
+      </w:r>
+      <w:r>
+        <w:rPr>
+          <w:b/>
+          <w:bCs/>
+          <w:color w:val="0070C0"/>
+          <w:vertAlign w:val="superscript"/>
+        </w:rPr>
+        <w:t>[</w:t>
+      </w:r>
+      <w:r>
+        <w:rPr>
+          <w:b/>
+          <w:bCs/>
+          <w:color w:val="0070C0"/>
+          <w:vertAlign w:val="superscript"/>
+        </w:rPr>
+        <w:t>12</w:t>
+      </w:r>
+      <w:r>
+        <w:rPr>
+          <w:b/>
+          <w:bCs/>
+          <w:color w:val="0070C0"/>
+          <w:vertAlign w:val="superscript"/>
+        </w:rPr>
+        <w:t>]</w:t>
+      </w:r>
+      <w:r>
+        <w:t xml:space="preserve"> motivating </w:t>
+      </w:r>
+      <w:r>
+        <w:t>the need to development team involvement is provided in the references section</w:t>
       </w:r>
       <w:r>
         <w:t>.</w:t>
@@ -1810,8 +1871,6 @@
       </w:r>
       <w:r>
         <w:tab/>
-      </w:r>
-      <w:r>
         <w:t xml:space="preserve">Because of the nature of fuzz testing, the activities laid out in the </w:t>
       </w:r>
       <w:r>
@@ -1822,13 +1881,7 @@
         <w:t>Secure Settings</w:t>
       </w:r>
       <w:r>
-        <w:t xml:space="preserve"> procedures will be deviated from</w:t>
-      </w:r>
-      <w:r>
-        <w:t>.</w:t>
-      </w:r>
-      <w:r>
-        <w:t xml:space="preserve"> These deviations will be covered in the next section.</w:t>
+        <w:t xml:space="preserve"> procedures will be deviated from. These deviations will be covered in the next section.</w:t>
       </w:r>
     </w:p>
     <w:p>
@@ -2053,10 +2106,7 @@
         <w:tab/>
       </w:r>
       <w:r>
-        <w:t>This activity uses a fuzz testing-specific version of the options template covered later in this document</w:t>
-      </w:r>
-      <w:r>
-        <w:t>.</w:t>
+        <w:t>This activity uses a fuzz testing-specific version of the options template covered later in this document.</w:t>
       </w:r>
     </w:p>
     <w:p>
@@ -2537,13 +2587,7 @@
         <w:tab/>
       </w:r>
       <w:r>
-        <w:t xml:space="preserve">The general approach to </w:t>
-      </w:r>
-      <w:r>
-        <w:t>this activity</w:t>
-      </w:r>
-      <w:r>
-        <w:t xml:space="preserve"> is covered in the </w:t>
+        <w:t xml:space="preserve">The general approach to this activity is covered in the </w:t>
       </w:r>
       <w:r>
         <w:rPr>
@@ -2842,7 +2886,14 @@
           <w:b/>
           <w:bCs/>
         </w:rPr>
-        <w:t>tool cybersecurity</w:t>
+        <w:t xml:space="preserve">tool cybersecurity </w:t>
+      </w:r>
+      <w:r>
+        <w:rPr>
+          <w:b/>
+          <w:bCs/>
+        </w:rPr>
+        <w:t>options template</w:t>
       </w:r>
       <w:r>
         <w:rPr>
@@ -2852,34 +2903,101 @@
         <w:t xml:space="preserve"> </w:t>
       </w:r>
       <w:r>
-        <w:rPr>
-          <w:b/>
-          <w:bCs/>
-        </w:rPr>
-        <w:t>options template</w:t>
-      </w:r>
-      <w:r>
-        <w:rPr>
-          <w:b/>
-          <w:bCs/>
+        <w:t>Microsoft Excel workbook</w:t>
+      </w:r>
+      <w:r>
+        <w:t>s</w:t>
+      </w:r>
+      <w:r>
+        <w:rPr>
+          <w:b/>
+          <w:bCs/>
+          <w:color w:val="0070C0"/>
         </w:rPr>
         <w:t xml:space="preserve"> </w:t>
       </w:r>
       <w:r>
-        <w:t>Microsoft Excel workbook</w:t>
-      </w:r>
-      <w:r>
-        <w:t>s</w:t>
-      </w:r>
-      <w:r>
-        <w:rPr>
-          <w:b/>
-          <w:bCs/>
-          <w:color w:val="0070C0"/>
+        <w:rPr>
+          <w:b/>
+          <w:bCs/>
+          <w:color w:val="0070C0"/>
+          <w:vertAlign w:val="superscript"/>
+        </w:rPr>
+        <w:t>[</w:t>
+      </w:r>
+      <w:r>
+        <w:rPr>
+          <w:b/>
+          <w:bCs/>
+          <w:color w:val="0070C0"/>
+          <w:vertAlign w:val="superscript"/>
+        </w:rPr>
+        <w:t>1</w:t>
+      </w:r>
+      <w:r>
+        <w:rPr>
+          <w:b/>
+          <w:bCs/>
+          <w:color w:val="0070C0"/>
+          <w:vertAlign w:val="superscript"/>
+        </w:rPr>
+        <w:t>0</w:t>
+      </w:r>
+      <w:r>
+        <w:rPr>
+          <w:b/>
+          <w:bCs/>
+          <w:color w:val="0070C0"/>
+          <w:vertAlign w:val="superscript"/>
+        </w:rPr>
+        <w:t>]</w:t>
+      </w:r>
+      <w:r>
+        <w:rPr>
+          <w:b/>
+          <w:bCs/>
+        </w:rPr>
+        <w:t>.</w:t>
+      </w:r>
+      <w:r>
+        <w:rPr>
+          <w:b/>
+          <w:bCs/>
         </w:rPr>
         <w:t xml:space="preserve"> </w:t>
       </w:r>
       <w:r>
+        <w:t xml:space="preserve">These workbooks are covered in the </w:t>
+      </w:r>
+      <w:r>
+        <w:rPr>
+          <w:b/>
+          <w:bCs/>
+        </w:rPr>
+        <w:t>AVCDL</w:t>
+      </w:r>
+      <w:r>
+        <w:t xml:space="preserve"> </w:t>
+      </w:r>
+      <w:r>
+        <w:rPr>
+          <w:b/>
+          <w:bCs/>
+        </w:rPr>
+        <w:t>Secure Settings</w:t>
+      </w:r>
+      <w:r>
+        <w:t xml:space="preserve"> tertiary documents</w:t>
+      </w:r>
+      <w:r>
+        <w:rPr>
+          <w:b/>
+          <w:bCs/>
+          <w:color w:val="0070C0"/>
+        </w:rPr>
+        <w:t xml:space="preserve"> </w:t>
+      </w:r>
+      <w:r>
         <w:rPr>
           <w:b/>
           <w:bCs/>
@@ -2895,7 +3013,7 @@
           <w:color w:val="0070C0"/>
           <w:vertAlign w:val="superscript"/>
         </w:rPr>
-        <w:t>1</w:t>
+        <w:t>4</w:t>
       </w:r>
       <w:r>
         <w:rPr>
@@ -2904,7 +3022,7 @@
           <w:color w:val="0070C0"/>
           <w:vertAlign w:val="superscript"/>
         </w:rPr>
-        <w:t>0</w:t>
+        <w:t xml:space="preserve">, </w:t>
       </w:r>
       <w:r>
         <w:rPr>
@@ -2913,119 +3031,38 @@
           <w:color w:val="0070C0"/>
           <w:vertAlign w:val="superscript"/>
         </w:rPr>
+        <w:t>5</w:t>
+      </w:r>
+      <w:r>
+        <w:rPr>
+          <w:b/>
+          <w:bCs/>
+          <w:color w:val="0070C0"/>
+          <w:vertAlign w:val="superscript"/>
+        </w:rPr>
+        <w:t xml:space="preserve">, </w:t>
+      </w:r>
+      <w:r>
+        <w:rPr>
+          <w:b/>
+          <w:bCs/>
+          <w:color w:val="0070C0"/>
+          <w:vertAlign w:val="superscript"/>
+        </w:rPr>
+        <w:t>6</w:t>
+      </w:r>
+      <w:r>
+        <w:rPr>
+          <w:b/>
+          <w:bCs/>
+          <w:color w:val="0070C0"/>
+          <w:vertAlign w:val="superscript"/>
+        </w:rPr>
         <w:t>]</w:t>
       </w:r>
       <w:r>
-        <w:rPr>
-          <w:b/>
-          <w:bCs/>
-        </w:rPr>
         <w:t>.</w:t>
       </w:r>
-      <w:r>
-        <w:rPr>
-          <w:b/>
-          <w:bCs/>
-        </w:rPr>
-        <w:t xml:space="preserve"> </w:t>
-      </w:r>
-      <w:r>
-        <w:t xml:space="preserve">These workbooks are covered in the </w:t>
-      </w:r>
-      <w:r>
-        <w:rPr>
-          <w:b/>
-          <w:bCs/>
-        </w:rPr>
-        <w:t>AVCDL</w:t>
-      </w:r>
-      <w:r>
-        <w:t xml:space="preserve"> </w:t>
-      </w:r>
-      <w:r>
-        <w:rPr>
-          <w:b/>
-          <w:bCs/>
-        </w:rPr>
-        <w:t>Secure Settings</w:t>
-      </w:r>
-      <w:r>
-        <w:t xml:space="preserve"> tertiary documents</w:t>
-      </w:r>
-      <w:r>
-        <w:rPr>
-          <w:b/>
-          <w:bCs/>
-          <w:color w:val="0070C0"/>
-        </w:rPr>
-        <w:t xml:space="preserve"> </w:t>
-      </w:r>
-      <w:r>
-        <w:rPr>
-          <w:b/>
-          <w:bCs/>
-          <w:color w:val="0070C0"/>
-          <w:vertAlign w:val="superscript"/>
-        </w:rPr>
-        <w:t>[</w:t>
-      </w:r>
-      <w:r>
-        <w:rPr>
-          <w:b/>
-          <w:bCs/>
-          <w:color w:val="0070C0"/>
-          <w:vertAlign w:val="superscript"/>
-        </w:rPr>
-        <w:t>4</w:t>
-      </w:r>
-      <w:r>
-        <w:rPr>
-          <w:b/>
-          <w:bCs/>
-          <w:color w:val="0070C0"/>
-          <w:vertAlign w:val="superscript"/>
-        </w:rPr>
-        <w:t xml:space="preserve">, </w:t>
-      </w:r>
-      <w:r>
-        <w:rPr>
-          <w:b/>
-          <w:bCs/>
-          <w:color w:val="0070C0"/>
-          <w:vertAlign w:val="superscript"/>
-        </w:rPr>
-        <w:t>5</w:t>
-      </w:r>
-      <w:r>
-        <w:rPr>
-          <w:b/>
-          <w:bCs/>
-          <w:color w:val="0070C0"/>
-          <w:vertAlign w:val="superscript"/>
-        </w:rPr>
-        <w:t xml:space="preserve">, </w:t>
-      </w:r>
-      <w:r>
-        <w:rPr>
-          <w:b/>
-          <w:bCs/>
-          <w:color w:val="0070C0"/>
-          <w:vertAlign w:val="superscript"/>
-        </w:rPr>
-        <w:t>6</w:t>
-      </w:r>
-      <w:r>
-        <w:rPr>
-          <w:b/>
-          <w:bCs/>
-          <w:color w:val="0070C0"/>
-          <w:vertAlign w:val="superscript"/>
-        </w:rPr>
-        <w:t>]</w:t>
-      </w:r>
-      <w:r>
-        <w:t>.</w:t>
-      </w:r>
     </w:p>
     <w:p>
       <w:pPr>
@@ -3055,10 +3092,7 @@
       </w:pPr>
       <w:r>
         <w:lastRenderedPageBreak/>
-        <w:t>Fuzz Testing Framework</w:t>
-      </w:r>
-      <w:r>
-        <w:t xml:space="preserve"> Options </w:t>
+        <w:t xml:space="preserve">Fuzz Testing Framework Options </w:t>
       </w:r>
       <w:r>
         <w:t>Template</w:t>
@@ -3072,10 +3106,7 @@
         <w:t xml:space="preserve">The </w:t>
       </w:r>
       <w:r>
-        <w:t>fuzz testing framework</w:t>
-      </w:r>
-      <w:r>
-        <w:t xml:space="preserve"> options </w:t>
+        <w:t xml:space="preserve">fuzz testing framework options </w:t>
       </w:r>
       <w:r>
         <w:t xml:space="preserve">may be documented using the </w:t>
@@ -3092,14 +3123,7 @@
           <w:b/>
           <w:bCs/>
         </w:rPr>
-        <w:t>fuzz testing framework</w:t>
-      </w:r>
-      <w:r>
-        <w:rPr>
-          <w:b/>
-          <w:bCs/>
-        </w:rPr>
-        <w:t xml:space="preserve"> options</w:t>
+        <w:t>fuzz testing framework options</w:t>
       </w:r>
       <w:r>
         <w:rPr>
@@ -4191,10 +4215,7 @@
         <w:t>is recommended</w:t>
       </w:r>
       <w:r>
-        <w:t xml:space="preserve"> </w:t>
-      </w:r>
-      <w:r>
-        <w:t xml:space="preserve">(such as </w:t>
+        <w:t xml:space="preserve"> (such as </w:t>
       </w:r>
       <w:r>
         <w:rPr>
@@ -4376,7 +4397,72 @@
           <w:sz w:val="21"/>
           <w:szCs w:val="21"/>
         </w:rPr>
-        <w:t>FW_HFP_LINUX_GCC-0</w:t>
+        <w:t>FW_HFP_LINUX_GCC-02</w:t>
+      </w:r>
+      <w:r>
+        <w:t>).</w:t>
+      </w:r>
+    </w:p>
+    <w:p>
+      <w:pPr>
+        <w:pStyle w:val="Heading3"/>
+      </w:pPr>
+      <w:r>
+        <w:t>Option</w:t>
+      </w:r>
+    </w:p>
+    <w:p>
+      <w:r>
+        <w:t xml:space="preserve">This is the </w:t>
+      </w:r>
+      <w:r>
+        <w:t xml:space="preserve">short </w:t>
+      </w:r>
+      <w:r>
+        <w:t xml:space="preserve">name </w:t>
+      </w:r>
+      <w:r>
+        <w:t>assigned to</w:t>
+      </w:r>
+      <w:r>
+        <w:t xml:space="preserve"> th</w:t>
+      </w:r>
+      <w:r>
+        <w:t>is particular</w:t>
+      </w:r>
+      <w:r>
+        <w:t xml:space="preserve"> </w:t>
+      </w:r>
+      <w:r>
+        <w:t>framework</w:t>
+      </w:r>
+      <w:r>
+        <w:t xml:space="preserve"> configuration</w:t>
+      </w:r>
+      <w:r>
+        <w:t>.</w:t>
+      </w:r>
+    </w:p>
+    <w:p>
+      <w:pPr>
+        <w:ind w:left="720" w:hanging="720"/>
+      </w:pPr>
+      <w:r>
+        <w:rPr>
+          <w:b/>
+          <w:bCs/>
+          <w:color w:val="0070C0"/>
+        </w:rPr>
+        <w:t>Note:</w:t>
+      </w:r>
+      <w:r>
+        <w:tab/>
+      </w:r>
+      <w:r>
+        <w:t>It may reflect the ID</w:t>
+      </w:r>
+      <w:r>
+        <w:t xml:space="preserve"> (</w:t>
       </w:r>
       <w:r>
         <w:rPr>
@@ -4387,10 +4473,28 @@
           <w:sz w:val="21"/>
           <w:szCs w:val="21"/>
         </w:rPr>
-        <w:t>2</w:t>
-      </w:r>
-      <w:r>
-        <w:t>).</w:t>
+        <w:t>honggfuzz_persistent_clang</w:t>
+      </w:r>
+      <w:r>
+        <w:t>) or be generic when only one variant exists</w:t>
+      </w:r>
+      <w:r>
+        <w:t xml:space="preserve"> (</w:t>
+      </w:r>
+      <w:r>
+        <w:rPr>
+          <w:rFonts w:ascii="Courier New" w:hAnsi="Courier New" w:cs="Courier New"/>
+          <w:b/>
+          <w:bCs/>
+          <w:color w:val="0070C0"/>
+        </w:rPr>
+        <w:t>FuzzTest</w:t>
+      </w:r>
+      <w:r>
+        <w:t>)</w:t>
+      </w:r>
+      <w:r>
+        <w:t>.</w:t>
       </w:r>
     </w:p>
     <w:p>
@@ -4398,7 +4502,7 @@
         <w:pStyle w:val="Heading3"/>
       </w:pPr>
       <w:r>
-        <w:t>Option</w:t>
+        <w:t>Framework</w:t>
       </w:r>
     </w:p>
     <w:p>
@@ -4406,85 +4510,54 @@
         <w:t xml:space="preserve">This is the </w:t>
       </w:r>
       <w:r>
-        <w:t xml:space="preserve">short </w:t>
-      </w:r>
-      <w:r>
-        <w:t xml:space="preserve">name </w:t>
-      </w:r>
-      <w:r>
-        <w:t>assigned to</w:t>
-      </w:r>
-      <w:r>
-        <w:t xml:space="preserve"> th</w:t>
-      </w:r>
-      <w:r>
-        <w:t>is particular</w:t>
+        <w:t>name of the framework.</w:t>
+      </w:r>
+    </w:p>
+    <w:p>
+      <w:pPr>
+        <w:ind w:left="720" w:hanging="720"/>
+      </w:pPr>
+      <w:r>
+        <w:rPr>
+          <w:b/>
+          <w:bCs/>
+          <w:color w:val="0070C0"/>
+        </w:rPr>
+        <w:t>Note:</w:t>
+      </w:r>
+      <w:r>
+        <w:tab/>
+      </w:r>
+      <w:r>
+        <w:t xml:space="preserve">This is a </w:t>
+      </w:r>
+      <w:r>
+        <w:t>text</w:t>
+      </w:r>
+      <w:r>
+        <w:t xml:space="preserve"> field</w:t>
+      </w:r>
+      <w:r>
+        <w:t>.</w:t>
       </w:r>
       <w:r>
         <w:t xml:space="preserve"> </w:t>
       </w:r>
       <w:r>
-        <w:t>framework</w:t>
-      </w:r>
-      <w:r>
-        <w:t xml:space="preserve"> configuration</w:t>
-      </w:r>
-      <w:r>
-        <w:t>.</w:t>
-      </w:r>
-    </w:p>
-    <w:p>
-      <w:pPr>
-        <w:ind w:left="720" w:hanging="720"/>
-      </w:pPr>
-      <w:r>
-        <w:rPr>
-          <w:b/>
-          <w:bCs/>
-          <w:color w:val="0070C0"/>
-        </w:rPr>
-        <w:t>Note:</w:t>
-      </w:r>
-      <w:r>
-        <w:tab/>
-      </w:r>
-      <w:r>
-        <w:t>It may reflect the ID</w:t>
-      </w:r>
-      <w:r>
-        <w:t xml:space="preserve"> (</w:t>
-      </w:r>
-      <w:r>
-        <w:rPr>
-          <w:rFonts w:ascii="Courier New" w:hAnsi="Courier New" w:cs="Courier New"/>
-          <w:b/>
-          <w:bCs/>
-          <w:color w:val="0070C0"/>
-          <w:sz w:val="21"/>
-          <w:szCs w:val="21"/>
-        </w:rPr>
-        <w:t>honggfuzz_persistent_clang</w:t>
-      </w:r>
-      <w:r>
-        <w:t>) or be generic when only one variant exists</w:t>
-      </w:r>
-      <w:r>
-        <w:t xml:space="preserve"> (</w:t>
-      </w:r>
-      <w:r>
-        <w:rPr>
-          <w:rFonts w:ascii="Courier New" w:hAnsi="Courier New" w:cs="Courier New"/>
-          <w:b/>
-          <w:bCs/>
-          <w:color w:val="0070C0"/>
-        </w:rPr>
-        <w:t>FuzzTest</w:t>
-      </w:r>
-      <w:r>
-        <w:t>)</w:t>
-      </w:r>
-      <w:r>
-        <w:t>.</w:t>
+        <w:t>If there is a common set of values, the field may be converted to a</w:t>
+      </w:r>
+      <w:r>
+        <w:t xml:space="preserve"> list populated from a column on the </w:t>
+      </w:r>
+      <w:r>
+        <w:rPr>
+          <w:b/>
+          <w:bCs/>
+        </w:rPr>
+        <w:t>legend</w:t>
+      </w:r>
+      <w:r>
+        <w:t xml:space="preserve"> sheet.</w:t>
       </w:r>
     </w:p>
     <w:p>
@@ -4492,7 +4565,7 @@
         <w:pStyle w:val="Heading3"/>
       </w:pPr>
       <w:r>
-        <w:t>Framework</w:t>
+        <w:t>Framework Version</w:t>
       </w:r>
     </w:p>
     <w:p>
@@ -4500,54 +4573,7 @@
         <w:t xml:space="preserve">This is the </w:t>
       </w:r>
       <w:r>
-        <w:t>name of the framework.</w:t>
-      </w:r>
-    </w:p>
-    <w:p>
-      <w:pPr>
-        <w:ind w:left="720" w:hanging="720"/>
-      </w:pPr>
-      <w:r>
-        <w:rPr>
-          <w:b/>
-          <w:bCs/>
-          <w:color w:val="0070C0"/>
-        </w:rPr>
-        <w:t>Note:</w:t>
-      </w:r>
-      <w:r>
-        <w:tab/>
-      </w:r>
-      <w:r>
-        <w:t xml:space="preserve">This is a </w:t>
-      </w:r>
-      <w:r>
-        <w:t>text</w:t>
-      </w:r>
-      <w:r>
-        <w:t xml:space="preserve"> field</w:t>
-      </w:r>
-      <w:r>
-        <w:t>.</w:t>
-      </w:r>
-      <w:r>
-        <w:t xml:space="preserve"> </w:t>
-      </w:r>
-      <w:r>
-        <w:t>If there is a common set of values, the field may be converted to a</w:t>
-      </w:r>
-      <w:r>
-        <w:t xml:space="preserve"> list populated from a column on the </w:t>
-      </w:r>
-      <w:r>
-        <w:rPr>
-          <w:b/>
-          <w:bCs/>
-        </w:rPr>
-        <w:t>legend</w:t>
-      </w:r>
-      <w:r>
-        <w:t xml:space="preserve"> sheet.</w:t>
+        <w:t>version of the framework.</w:t>
       </w:r>
     </w:p>
     <w:p>
@@ -4555,33 +4581,8 @@
         <w:pStyle w:val="Heading3"/>
       </w:pPr>
       <w:r>
-        <w:t>Framework</w:t>
-      </w:r>
-      <w:r>
-        <w:t xml:space="preserve"> Version</w:t>
-      </w:r>
-    </w:p>
-    <w:p>
-      <w:r>
-        <w:t xml:space="preserve">This is the </w:t>
-      </w:r>
-      <w:r>
-        <w:t>version</w:t>
-      </w:r>
-      <w:r>
-        <w:t xml:space="preserve"> of the framework.</w:t>
-      </w:r>
-    </w:p>
-    <w:p>
-      <w:pPr>
-        <w:pStyle w:val="Heading3"/>
-      </w:pPr>
-      <w:r>
         <w:lastRenderedPageBreak/>
-        <w:t>Framework</w:t>
-      </w:r>
-      <w:r>
-        <w:t xml:space="preserve"> Features</w:t>
+        <w:t>Framework Features</w:t>
       </w:r>
     </w:p>
     <w:p>
@@ -4589,16 +4590,7 @@
         <w:t xml:space="preserve">This is </w:t>
       </w:r>
       <w:r>
-        <w:t>a list of</w:t>
-      </w:r>
-      <w:r>
-        <w:t xml:space="preserve"> framework</w:t>
-      </w:r>
-      <w:r>
-        <w:t xml:space="preserve"> features needed for this option</w:t>
-      </w:r>
-      <w:r>
-        <w:t>.</w:t>
+        <w:t>a list of framework features needed for this option.</w:t>
       </w:r>
     </w:p>
     <w:p>
@@ -4858,13 +4850,7 @@
         <w:pStyle w:val="Heading3"/>
       </w:pPr>
       <w:r>
-        <w:t xml:space="preserve">Minimum </w:t>
-      </w:r>
-      <w:r>
-        <w:t>Compiler</w:t>
-      </w:r>
-      <w:r>
-        <w:t xml:space="preserve"> Version</w:t>
+        <w:t>Minimum Compiler Version</w:t>
       </w:r>
     </w:p>
     <w:p>
@@ -4872,16 +4858,7 @@
         <w:t xml:space="preserve">This </w:t>
       </w:r>
       <w:r>
-        <w:t xml:space="preserve">is the </w:t>
-      </w:r>
-      <w:r>
-        <w:t xml:space="preserve">minimum </w:t>
-      </w:r>
-      <w:r>
-        <w:t xml:space="preserve">compiler </w:t>
-      </w:r>
-      <w:r>
-        <w:t>version required for this option</w:t>
+        <w:t>is the minimum compiler version required for this option</w:t>
       </w:r>
       <w:r>
         <w:t>.</w:t>
@@ -4892,10 +4869,7 @@
         <w:pStyle w:val="Heading3"/>
       </w:pPr>
       <w:r>
-        <w:t>Compiler</w:t>
-      </w:r>
-      <w:r>
-        <w:t xml:space="preserve"> Options</w:t>
+        <w:t>Compiler Options</w:t>
       </w:r>
     </w:p>
     <w:p>
@@ -4903,19 +4877,7 @@
         <w:t xml:space="preserve">This </w:t>
       </w:r>
       <w:r>
-        <w:t xml:space="preserve">is the </w:t>
-      </w:r>
-      <w:r>
-        <w:t xml:space="preserve">list of </w:t>
-      </w:r>
-      <w:r>
-        <w:t>compiler</w:t>
-      </w:r>
-      <w:r>
-        <w:t xml:space="preserve"> options need to enable</w:t>
-      </w:r>
-      <w:r>
-        <w:t xml:space="preserve"> the framework</w:t>
+        <w:t>is the list of compiler options need to enable the framework</w:t>
       </w:r>
       <w:r>
         <w:t>.</w:t>
@@ -4938,10 +4900,7 @@
         <w:t xml:space="preserve">This </w:t>
       </w:r>
       <w:r>
-        <w:t xml:space="preserve">is the </w:t>
-      </w:r>
-      <w:r>
-        <w:t>use case for this framework option</w:t>
+        <w:t>is the use case for this framework option</w:t>
       </w:r>
       <w:r>
         <w:t>.</w:t>
@@ -4963,10 +4922,7 @@
         <w:tab/>
       </w:r>
       <w:r>
-        <w:t xml:space="preserve">This field is </w:t>
-      </w:r>
-      <w:r>
-        <w:t xml:space="preserve">an auto-generated list populated from the </w:t>
+        <w:t xml:space="preserve">This field is an auto-generated list populated from the </w:t>
       </w:r>
       <w:r>
         <w:rPr>
@@ -5326,19 +5282,7 @@
         <w:tab/>
       </w:r>
       <w:r>
-        <w:t xml:space="preserve">This </w:t>
-      </w:r>
-      <w:r>
-        <w:t>column</w:t>
-      </w:r>
-      <w:r>
-        <w:t xml:space="preserve"> is </w:t>
-      </w:r>
-      <w:r>
-        <w:t>used to populate</w:t>
-      </w:r>
-      <w:r>
-        <w:t xml:space="preserve"> the </w:t>
+        <w:t xml:space="preserve">This column is used to populate the </w:t>
       </w:r>
       <w:r>
         <w:rPr>
@@ -5355,10 +5299,7 @@
         <w:t>y</w:t>
       </w:r>
       <w:r>
-        <w:t xml:space="preserve"> </w:t>
-      </w:r>
-      <w:r>
-        <w:t xml:space="preserve">field list on the </w:t>
+        <w:t xml:space="preserve"> field list on the </w:t>
       </w:r>
       <w:r>
         <w:rPr>
@@ -5368,10 +5309,7 @@
         <w:t>options</w:t>
       </w:r>
       <w:r>
-        <w:t xml:space="preserve"> </w:t>
-      </w:r>
-      <w:r>
-        <w:t>sheet</w:t>
+        <w:t xml:space="preserve"> sheet</w:t>
       </w:r>
       <w:r>
         <w:t>.</w:t>
@@ -5673,10 +5611,7 @@
         <w:t xml:space="preserve"> </w:t>
       </w:r>
       <w:r>
-        <w:t>of</w:t>
-      </w:r>
-      <w:r>
-        <w:t xml:space="preserve"> an instance of the template</w:t>
+        <w:t>of an instance of the template</w:t>
       </w:r>
       <w:r>
         <w:t xml:space="preserve"> should not be edited. If an unlisted value is required, the template should be separately revised.</w:t>
@@ -6099,24 +6034,67 @@
           <w:b/>
           <w:bCs/>
         </w:rPr>
-        <w:t>AVCDL element-specific tool cybersecurity options template</w:t>
-      </w:r>
-      <w:r>
-        <w:rPr>
-          <w:b/>
-          <w:bCs/>
+        <w:t xml:space="preserve">AVCDL element-specific tool cybersecurity options template </w:t>
+      </w:r>
+      <w:r>
+        <w:t>(AVCDL template)</w:t>
+      </w:r>
+    </w:p>
+    <w:p>
+      <w:pPr>
+        <w:pStyle w:val="ListParagraph"/>
+        <w:numPr>
+          <w:ilvl w:val="0"/>
+          <w:numId w:val="3"/>
+        </w:numPr>
+        <w:jc w:val="left"/>
+        <w:rPr>
+          <w:color w:val="000000" w:themeColor="text1"/>
+        </w:rPr>
+      </w:pPr>
+      <w:r>
+        <w:rPr>
+          <w:b/>
+          <w:bCs/>
+          <w:color w:val="000000" w:themeColor="text1"/>
+        </w:rPr>
+        <w:t>Christian Holler: The Human Component in Bug Finding @FuzzCon Europe 2020</w:t>
+      </w:r>
+      <w:r>
+        <w:rPr>
+          <w:color w:val="000000" w:themeColor="text1"/>
+        </w:rPr>
+        <w:br/>
+      </w:r>
+      <w:hyperlink r:id="rId20" w:history="1">
+        <w:r>
+          <w:rPr>
+            <w:rStyle w:val="Hyperlink"/>
+          </w:rPr>
+          <w:t>https://www.youtube.com/watch?v=ifc2C5fLIWU</w:t>
+        </w:r>
+      </w:hyperlink>
+      <w:r>
+        <w:rPr>
+          <w:color w:val="000000" w:themeColor="text1"/>
         </w:rPr>
         <w:t xml:space="preserve"> </w:t>
       </w:r>
-      <w:r>
-        <w:t>(AVCDL template)</w:t>
-      </w:r>
+    </w:p>
+    <w:p>
+      <w:pPr>
+        <w:ind w:left="360"/>
+        <w:rPr>
+          <w:b/>
+          <w:bCs/>
+        </w:rPr>
+      </w:pPr>
     </w:p>
     <w:p/>
     <w:sectPr>
-      <w:footerReference w:type="even" r:id="rId20"/>
-      <w:footerReference w:type="default" r:id="rId21"/>
-      <w:headerReference w:type="first" r:id="rId22"/>
+      <w:footerReference w:type="even" r:id="rId21"/>
+      <w:footerReference w:type="default" r:id="rId22"/>
+      <w:headerReference w:type="first" r:id="rId23"/>
       <w:pgSz w:w="12226" w:h="15840"/>
       <w:pgMar w:top="1440" w:right="1440" w:bottom="1440" w:left="1440" w:header="720" w:footer="0" w:gutter="0"/>
       <w:pgNumType w:start="1"/>

</xml_diff>